<commit_message>
Antigravity: ### 1. Mecelle Madde 357 Atıf Hatası (1. Delil) 1. Delil’i…
</commit_message>
<xml_diff>
--- a/docs/planli_eskitme_hukuki_model.docx
+++ b/docs/planli_eskitme_hukuki_model.docx
@@ -25,7 +25,7 @@
           <w:color w:val="646464"/>
           <w:sz w:val="22"/>
         </w:rPr>
-        <w:t>A Formal Juristic &amp; Economic Analysis Based on Tenkîh-i Menât</w:t>
+        <w:t>A Formal Juristic &amp; Economic Model: Resolving the Sale vs. Guardianship Dichotomy</w:t>
       </w:r>
     </w:p>
     <w:p/>
@@ -40,14 +40,79 @@
         <w:t>Today I will speak about planned obsolescence and its legal, rational and moral ruling.</w:t>
         <w:br/>
         <w:t>I will not argue from objects. A machine, a part, a battery or a program carries its own physics, its own safety rules and its own laws, and the moment I name one of them, the argument turns into a debate about that thing and I lose the principle. So I will take the principle out of every object. In the language of the jurists this is the purification of the ground, tenkîh-i menât: I remove the brand, the model and the material, and I keep only what the ruling really depends on. What remains is a model with parties, a contract, ownership and a few variables. Every example in this talk is built only on this model and on its four forms.</w:t>
+      </w:r>
+    </w:p>
+    <w:p>
+      <w:pPr>
+        <w:spacing w:after="120" w:line="276" w:lineRule="auto"/>
+      </w:pPr>
+      <w:r>
+        <w:rPr>
+          <w:sz w:val="21"/>
+        </w:rPr>
+        <w:t>Here are the variables. The seller is S. The buyer is B. The durable good that is sold is X. The price that B pays is P. The expected durable life of X, which nature, material science and the custom of the market give it, is E, measured in units of operational time. The artificial limit that S engineers or imposes on the life of X without disclosure is L, also measured in units of operational time, where L is strictly shorter than E. And there is one filter that I call the technical filter: T. It stands for every objective technical, safety or statutory necessity: protection of life, material integrity, emission standards, or cryptographic integrity. T equals zero when no such necessity exists.</w:t>
+      </w:r>
+    </w:p>
+    <w:p>
+      <w:pPr>
+        <w:spacing w:before="240" w:after="80"/>
+      </w:pPr>
+      <w:r>
+        <w:rPr>
+          <w:b/>
+          <w:color w:val="1E3C6E"/>
+          <w:sz w:val="24"/>
+        </w:rPr>
+        <w:t>THE ROOT CHARACTERIZATION: SALE VERSUS DIGITAL GUARDIANSHIP.</w:t>
         <w:br/>
-        <w:t>Here are the variables. The seller is S. The buyer is B. The durable good that is sold is X. The price that B pays is P. The expected life of X, which nature, the science of materials and the custom of the market give it, is E. The limit that S puts on the life of X without telling B is L, and L is shorter than E. And there is one filter that I call the technical filter. It stands for every legitimate reason that an engineer, a safety rule or a law can give for a limit: protection of the good, protection of life, noise, weight, cost, an emission rule, a cyber-security need. I call it T, and I say T equals zero when no such reason exists.</w:t>
+        <w:t xml:space="preserve">Before examining the models, the root conflict must be defined. Modern industry creates a profound contradiction in the law of obligations: S sells X under the outward form and full consideration of an absolute sale (bay'), pocketing a purchase price P that reflects complete transfer of ownership. Yet S simultaneously retains unilateral remote control, cryptographic locks, and telemetry channels, treating X as an ongoing servile custody or revocable license. </w:t>
         <w:br/>
-        <w:t>The axiom is this: planned obsolescence, as an unlawful deceit and unlawful act, exists where T equals zero. Where the maker has a technical, safety or legal reason, T is not zero; that domain is the domain of necessity or technical boundary, and I answer the maker's claims regarding it in the second side of this talk. Where he has none, where the only difference between the good that lasts E and the good that ends at L is that the second one ends early, there is no engineering shelter for him to hide in. And because the maker holds the facts, the burden of naming the reason is on him. The Mecelle says the proof is on the claimant, and here the one who claims necessity or technical constraint is the maker. If he can name no reason, T is zero.</w:t>
+        <w:t xml:space="preserve">Islamic jurisprudence and universal contract law reject this hybrid distortion: contracts are judged by their legal reality and substance, not by formalistic labels (Mecelle Article 3: "Al-ibratu fi'l-uqûd li'l-maqâsid wa'l-ma'ânî, lâ li'l-alfâz wa'l-mabânî"). </w:t>
         <w:br/>
-        <w:t>By planned obsolescence I mean a choice by the maker that shortens the useful life of a good he makes or sells, or takes away the owner's power to extend that life, where T is zero. The choice may be made before any sale, in the making of the good, or after the sale, by an act on it. Four things are outside this definition. First, ordinary wear, because nobody chose it. Second, a short life that is printed on the box or is the settled and known custom of that kind of goods, because the Mecelle says that what is known by custom is as if it were stipulated. Third, the real limit of the hardware: when a new program needs more than an old device has, the maker may decline to give the new feature and may declare the end of updates. Fourth, the loss of a function because an independent third party changed its own service, unless the maker built the good to depend on that service and did not say so. The maker may stop adding. He may end a service that he declared would end, with notice, leaving the good working or giving the owner what he needs to keep it alive. He may not kill.</w:t>
+        <w:t>If S sells X, ownership (milk) passes unconditionally to B; S's authority over X ceases entirely. S cannot collect the price of ownership while retaining the keys of lordship. If S wishes to retain remote disposal, ongoing operational control, and unilateral modification rights, S must honestly designate the transaction as a lease (ijârah) or a continuous service contract, charging periodic rent and assuming the full lessor's obligation to maintain and repair the asset. But to collect the capital price of absolute sale while maintaining remote guardianship is an unlawful combination that corrupts the contract.</w:t>
+      </w:r>
+    </w:p>
+    <w:p>
+      <w:pPr>
+        <w:spacing w:after="120" w:line="276" w:lineRule="auto"/>
+      </w:pPr>
+      <w:r>
+        <w:rPr>
+          <w:sz w:val="21"/>
+        </w:rPr>
+        <w:t>Planned obsolescence, as an unlawful commercial wrong, begins where T equals zero. The procedural rule of adjudication is preserved: in a court of law, B as claimant bears the initial burden under Mecelle Article 76 to present a prima facie showing of premature failure or artificial restriction L. Once this objective fact is demonstrated, the burden shifts to S to establish that the restriction was mandated by an authentic technical or safety constraint T. If S fails to prove any such engineering or legal necessity, T is established as zero.</w:t>
+      </w:r>
+    </w:p>
+    <w:p>
+      <w:pPr>
+        <w:spacing w:after="120" w:line="276" w:lineRule="auto"/>
+      </w:pPr>
+      <w:r>
+        <w:rPr>
+          <w:sz w:val="21"/>
+        </w:rPr>
+        <w:t>By planned obsolescence I mean a deliberate choice by the maker that artificially shortens the useful life of a good, or extinguishes the owner's legal ability to maintain and repair it, where T is zero. Four things remain strictly outside this definition:</w:t>
         <w:br/>
-        <w:t>The talk has two sides. On the first side stand our evidences, eight of them, built on four models. On the second side stand the evidences of the other side, the producers, four of them, and I will refute each one. Every evidence has the same shape: the claim, the proof that the effect follows from the cause, the instance in the model, and the rule.</w:t>
+        <w:t>First, natural material wear, which is unintended.</w:t>
+        <w:br/>
+        <w:t>Second, declared design limits: where S openly discloses the minimum rated operational cycle (MTBF or rated cycle) on the packaging or contract, because custom and explicit stipulation govern the terms (Mecelle Article 43: "Al-ma'rûfu urfan ka'l-mashrûti shartan").</w:t>
+        <w:br/>
+        <w:t>Third, authentic hardware exhaustion: where older hardware lacks the physical computational capacity to run newly developed programs, S may decline to offer new feature upgrades, freezing the legacy software in its working state.</w:t>
+        <w:br/>
+        <w:t>Fourth, third-party service discontinuation, provided S did not conceal an intrinsic dependency.</w:t>
+        <w:br/>
+        <w:t>S may stop adding features. S may conclude a declared service with reasonable notice. S may not sabotage what has been sold.</w:t>
+      </w:r>
+    </w:p>
+    <w:p>
+      <w:pPr>
+        <w:spacing w:after="120" w:line="276" w:lineRule="auto"/>
+      </w:pPr>
+      <w:r>
+        <w:rPr>
+          <w:sz w:val="21"/>
+        </w:rPr>
+        <w:t>The talk has two sides. On the first side stand our evidences, eight of them, built on four models. On the second side stand the producer defenses, four of them, and I will refute each one.</w:t>
       </w:r>
     </w:p>
     <w:p>
@@ -62,7 +127,7 @@
         </w:rPr>
         <w:t>MODEL ONE: THE LIMIT PLANTED BEFORE THE SALE.</w:t>
         <w:br/>
-        <w:t>Here is the model. S makes X. In making it, S has two technical choices, A one and A two. A one gives X the expected life E. A two gives X a life that ends at L. Between A one and A two there is no difference in cost, weight, noise, safety or law, so T is zero. S chooses A two only so that X ends early and the second sale comes sooner. B, at the time of the sale, which I call t zero, looks at the market and at custom, expects E, and pays P. To have numbers, let E be ten units of time and L be four. P was set for ten.</w:t>
+        <w:t>Here is the model. S manufactures X. In manufacturing, S has two technical choices, A one and A two. A one grants X its customary durable lifespan E. A two imposes an artificial design limit that terminates X at L. Between A one and A two there is no difference in manufacturing cost, weight, safety or statutory compliance, so T equals zero. S chooses A two solely to accelerate replacement demand. At time t zero, B observes customary market longevity E and pays price P, which incorporates that durable utility. For clarity of demonstration, let E be ten units of operational time and L be four units of operational time. P was determined upon the expectation of ten units.</w:t>
       </w:r>
     </w:p>
     <w:p>
@@ -75,13 +140,15 @@
           <w:color w:val="1E3C6E"/>
           <w:sz w:val="24"/>
         </w:rPr>
-        <w:t>OUR FIRST EVIDENCE: THE PRICE BUYS SOMETHING THE BUYER DOES NOT RECEIVE.</w:t>
+        <w:t>OUR FIRST EVIDENCE: FRAUDULENT DISPARITY AND CONCEALMENT OF VALUE.</w:t>
         <w:br/>
-        <w:t>The claim: a sale is sound only when what the buyer pays is matched by what he receives, and the part of the price that has no counter-value is taken without right. The proof has four steps. The price is set by what the buyer expects, and for a durable good that includes its ordinary life. At t zero S already knows the limit he chose, and B cannot see it. B pays for ten units and receives four. So a part of the price has no counter-value, and that part is the use value of the six missing units. Value is not spread evenly over the units of life, so I do not say that six tenths of the price is the exact share. The exact share is set by those who know the trade, as the jurists set value by the experts of the trade. What is established is that a part exists, and that it belongs to B.</w:t>
+        <w:t>The claim: in commutative contracts (mu'âwadât), mutual consent requires transparency regarding the essential attributes that define value, and price extracted through deliberate concealment of a lifespan-halving defect constitutes unlawful appropriation of property.</w:t>
         <w:br/>
-        <w:t>The Qur'an says in Surah An-Nisa, verse 29: "Do not consume your wealth among yourselves by false ways." Taking a price with no counter-value is eating property by a false way, ekl-i emvâl bi'l-bâtıl. The jurists also treat a gross gap between price and value, gabn-i fâhiş, and they measure it at the time of the contract. In the model the gap exists at t zero, because the limit was planted before the sale. The schools accept small gaps and draw the line between a small gap and a gross one anywhere from a twentieth of the value to a third. Six units out of ten is beyond every line that any school has drawn.</w:t>
+        <w:t>The proof: durable goods are acquired for their continuous stream of utility over time. When S intentionally plants limit L before sale, S knows the good is inherently defective in durability, while B cannot detect this latent defect at t zero. B pays price P expecting ten units of operational life, but receives an asset engineered to terminate at four. While contract law tolerates minor subjective discrepancies (gabn-i yesîr) in commercial goods, a deliberate truncation from ten units of life to four units constitutes an egregious, unconscionable disparity (gabn-i fâhiş) accompanied by active concealment (taghrîr).</w:t>
         <w:br/>
-        <w:t>The rule: when a sale is accompanied by fraudulent concealment and deceit (taghrir) causing a gross gap between price and value (gabn-i fâhiş), the contract is corrupted on the part of the deceiver. In the Hanafi view that Mecelle Article 356 and 357 codify, the deceived buyer B has the right to rescind the contract entirely and recover P, returning the defective good. If the good cannot be returned due to loss, destruction or substantial change, compensation for the missing value is due. The Hanbali school gives B a direct choice between rescinding the sale or keeping X with restitution of the excess price paid without counter-value. In both schools, the seller S has no lawful right to retain the unearned price against B's will.</w:t>
+        <w:t>The Qur'an commands in Surah An-Nisa, verse 29: "Do not consume your wealth among yourselves by false ways." Extracting the full market price of a durable good while concealing that more than half of its natural lifespan has been engineered out is consuming property by falsehood (ekl-i emvâl bi'l-bâtıl).</w:t>
+        <w:br/>
+        <w:t>The rule: a sale tainted by fraudulent concealment (taghrîr) and gross disparity (gabn-i fâhiş) is non-binding (ghayr lâzim) on the deceived buyer. Under Mecelle Article 356, B possesses the legal option to rescind the sale and recover the purchase price P in full upon returning X. If returning the good is barred due to consumption, destruction, or irreversible alteration, the governing rules of latent defect (Mecelle Articles 343, 344 and 345) entitle B to financial compensation for the price diminution (noksan-ı semen / arsh). The seller S cannot retain the full price.</w:t>
       </w:r>
     </w:p>
     <w:p>
@@ -96,11 +163,13 @@
         </w:rPr>
         <w:t>OUR SECOND EVIDENCE: A CONCEALED ATTRIBUTE AND DECEIT.</w:t>
         <w:br/>
-        <w:t>The claim: when the seller hides an essential attribute that sets the price, the contract is vitiated by gharar and by taghrir. The proof has four steps. The expected durable life of X is an implied quality (vasf) that sets its price. S alone knows L, and B has no means of discovering it at t zero. A seller who stays silent where speaking was needed makes a fraudulent misrepresentation by his silence, and the statement is that the good conforms to the customary standard. So B gives his consent on a false picture, and S made the false picture. The texts agree. The Prophet, peace be upon him, forbade the transaction corrupted by gharar, which Muslim reports. He also said: whoever deceives us is not one of us. He found wet grain under dry grain in a heap, and he asked the seller why he had not put it on top, so that people could see it. The buyer could not have found the wet grain himself, and the seller was still blamed. L is the wet grain at the bottom of the heap. In Hanafi jurisprudence, while general ignorance of the goods that leads to dispute makes a contract fasid, a latent defect or concealed deficiency in an identified object renders the sale non-binding (ghayr lazim), granting the buyer the full option of defect.</w:t>
+        <w:t>The claim: when the seller intentionally conceals a latent durability defect that governs market valuation, the contract is vitiated by deception (taghrîr) and uncertainty (gharar).</w:t>
         <w:br/>
-        <w:t>The instance: B can look at X as long as he wishes and will never find the number four. The number is in S's plan, and S says nothing.</w:t>
+        <w:t>The proof: durability in a durable asset is an implied core condition of fitness. S alone knows the hidden limit L, and B has no means of discovering it at t zero. A seller who maintains silence regarding an engineered flaw makes an affirmative misrepresentation by conduct, falsely warranting that the good conforms to sound custom. The Prophet, peace be upon him, forbade the sale infected with gharar, reported by Muslim. He also stated: "Whoever deceives us is not one of us," reproaching the merchant who concealed wet grain beneath dry grain. Hidden limit L is the wet grain at the bottom of the vessel. In Hanafi jurisprudence, a latent defect (ayb-i hafî) in a specific identified good does not void the contract ab initio, but strips it of binding force, creating an absolute option of defect.</w:t>
         <w:br/>
-        <w:t>The rule: because L was planted before the sale, it is a latent defect (ayb-i hafî) hidden at t zero. B holds the option of defect (khiyâr al-ayb). He may rescind the sale and recover P in full, or retain X if he so chooses, and where restitution of the good is barred, he is entitled to financial compensation (nuqsân-ı arz). If L had not been planted at t zero and were imposed later by remote interference, the matter would not be an original defect of sale; it would be an unauthorized act against another's property, governed by Model Two.</w:t>
+        <w:t>The instance: B examines X at purchase and finds no visible flaw; the premature termination code or weak link resides solely in S's hidden blueprint.</w:t>
+        <w:br/>
+        <w:t>The rule: because limit L existed at t zero, it is an original latent defect (ayb-i hafî). B holds the option of defect (khiyâr al-ayb). Under Mecelle Articles 337 and 356, B may rescind the transaction and recover P in full. If restitution of X is impossible, B recovers the price discount (noksan-ı semen) under Mecelle Articles 343-345.</w:t>
       </w:r>
     </w:p>
     <w:p>
@@ -113,13 +182,15 @@
           <w:color w:val="1E3C6E"/>
           <w:sz w:val="24"/>
         </w:rPr>
-        <w:t>OUR THIRD EVIDENCE: HARM DONE ON PURPOSE, AND THE GAIN THAT COMES FROM IT.</w:t>
+        <w:t>OUR THIRD EVIDENCE: DELIBERATE HARM AND UNLAWFUL ACCELERATION OF BENEFIT.</w:t>
         <w:br/>
-        <w:t>The claim: nobody may cause harm on purpose and then profit from it. The proof has five steps. Natural wear comes from the fatigue of materials, and nobody designs it. Here S's choice goes the other way: it is made so that X fails at L. Remove that choice, and B keeps X for ten units while S loses the second sale. So S's gain comes directly from B's loss. The loss is real, because B pays again at four units, six units before he planned to. A limit for which S can name no protective purpose has no lawful benefit. If a protective purpose exists, T is not zero, and S states it and tells B. And the harm has a second face. The price that B pays prematurely cannot be spent anywhere else. This is not stagnation of capital. It is misallocation of capital: resources that would have gone to productive investment, welfare or savings are forced into replacing what should not have failed.</w:t>
+        <w:t>The claim: nobody may intentionally inflict damage upon another and derive commercial enrichment from that harm.</w:t>
         <w:br/>
-        <w:t>The rules are two. The Mecelle says there is no harm and no answering harm with harm, and harm is removed (Articles 19 and 20). Nobody can obtain a lawful gain from a harm that he caused by his own intentional and unjust act. The second rule, Mecelle Article 99, says: "Men iste'cele şey'en kable evânihî ûkıbe bi-hırmânih." Whoever hastens something before its time by an illegitimate means is deprived of it (isticel). The classical case is the heir who kills his benefactor to inherit early; the law deprives him of the inheritance. I use the rule by strict juristic analogy. The underlying legal reason (illa) is hastening an unearned benefit before its due time by an illegitimate means, and that reason is fully present when S artificially brings the second replacement sale from ten units to four. B has a lawful claim to recover from S what this premature obsolescence cost him. S, as the one whose planning caused the failure, is a causer (mutasabbib), and Article 93 says that a causer is liable when he acted intentionally. The word planned supplies the intent.</w:t>
+        <w:t>The proof: natural degradation is an act of time; engineered failure is an act of design. S engineers failure at four units of operational time specifically so that B must replace X six units earlier than expected. S's accelerated sale is derived directly from B's artificial deprivation. A restriction devoid of technical justification (T=0) yields no lawful benefit. Furthermore, the capital that B is forced to spend prematurely is diverted from education, healthcare, and productive welfare into replacing an asset that should not have failed.</w:t>
         <w:br/>
-        <w:t>The instance: at four units, B is forced to replace X. The replacement was due after ten units, and S has artificially moved the second purchase six units forward.</w:t>
+        <w:t>The legal principles are two. First, Mecelle Article 19: "Harm is eliminated" (Al-dararu yuzâl). Second, the fundamental maxim codified in Mecelle Article 99: "Men iste'cele şey'en kable evânihî ûkıbe bi-hırmânih" (Whoever hastens something before its due time by an illegitimate means is penalized with deprivation thereof). In classical law, the heir who murders his benefactor to hasten inheritance is disqualified from inheriting. Applying this maxim by strict juristic analogy (qiyâs), S illegitimately hastens the second sale by sabotaging the first; the law deprives S of that ill-gotten benefit. S is a causal actor (mutasabbib) who acted with deliberate intent, and under Mecelle Article 93, the intentional causer is strictly liable for the resulting damage.</w:t>
+        <w:br/>
+        <w:t>The instance: at four units of time, B is forced to buy a replacement. The replacement was due after ten units, and S has artificially accelerated the second expenditure six units ahead of time.</w:t>
       </w:r>
     </w:p>
     <w:p>
@@ -134,7 +205,7 @@
         </w:rPr>
         <w:t>MODEL TWO: THE ACT ON THE GOOD AFTER THE SALE.</w:t>
         <w:br/>
-        <w:t>The model: the sale is complete at t zero, and full ownership and possession are wholly with B. No danger to life, no safety law and no security need arises, so T is zero. X does everything that was delivered. At a later time t one, S uses a remote channel that he retained, and he removes a function of X, or lowers its performance, or makes X reject parts that the owner installs to maintain it.</w:t>
+        <w:t>The model: the sale is finalized at t zero, and complete ownership and physical custody reside with B. No imminent peril to life, safety or security arises, so T equals zero. X performs every warranted function. At a later time t one, S utilizes a retained remote telemetry channel to unilaterally strip a capability, throttle performance, or trigger hardware rejection of authentic replacement components.</w:t>
       </w:r>
     </w:p>
     <w:p>
@@ -147,13 +218,15 @@
           <w:color w:val="1E3C6E"/>
           <w:sz w:val="24"/>
         </w:rPr>
-        <w:t>OUR FOURTH EVIDENCE: THE OWNER'S PROPERTY IS ACTED ON FROM AFAR.</w:t>
+        <w:t>OUR FOURTH EVIDENCE: UNLAWFUL TRESPASS AND EXCEEDING DELEGATED AUTHORITY.</w:t>
         <w:br/>
-        <w:t>The claim: when the sale is complete, S's power of disposal over X ends entirely, and any unilateral adverse act he executes on X afterwards is an unauthorized disposal in another man's property. The proof: a valid sale transfers complete ownership to B, and ownership entails the full exclusive right to use, alter, maintain and preserve the good. If S claims that B agreed to remote software updates at initial setup, that consent was given for maintenance, optimization and security; in the law of contract, a general consent for beneficial maintenance cannot be construed as a license to impair or degrade the good. Using a maintenance permission to inflict latent diminution of utility is an abuse of right and a deviation from the contract's object. The Mecelle says that nobody may act in another man's property without his permission, and nobody may take another man's property without a lawful cause, Articles 96 and 97. It also says that whoever tries to undo what is complete on his own side, his effort is rejected, Article 100. S's act is an unauthorized disposal (tasarruf fî milk al-ghayr) and an unlawful trespass.</w:t>
+        <w:t>The claim: upon completion of sale, S's proprietary authority over X is extinguished, and any subsequent unilateral adverse modification constitutes an unauthorized disposal in another man's property.</w:t>
         <w:br/>
-        <w:t>The instance: at t one, X is working as delivered. S transmits a remote change. B can no longer use the standard replacement part or feature, and the operational capability that the sale gave him is diminished by S's direct intervention.</w:t>
+        <w:t>The proof: sale transfers exclusive ownership (milk tamm) to B, encompassing the sole right to use, alter, preserve, or repair the asset. When S argues that B clicked "accept" to software updates at initial setup, contract law dictates that general consent given for operational stability and security maintenance cannot be converted into a license to degrade the good. In Islamic jurisprudence, an agent or trustee granted authority for maintenance (hifz) cannot execute an act of impairment (itlaf); acting beyond the scope of delegated authority constitutes unauthorized disposal (tasarruf fî milk al-ghayr) and breach of trust. Mecelle Article 96 establishes that no one may dispose of another's property without permission, and Article 100 provides that whoever attempts to revoke what has been perfected on his part, his attempt is rejected.</w:t>
         <w:br/>
-        <w:t>The rule: S acted directly upon X through code execution, so he is the direct actor (mubâshir), and the direct actor is strictly liable even without subjective intent, as Article 92 establishes. B may demand that the damaging modification be reversed and may claim compensation for all diminution in value and costs incurred. If preserving X as it was had presented an imminent safety hazard, T would not be zero; S would have been justified to intervene, provided he acted transparently and provided a prompt remedy. But he may not degrade property in secret for commercial advantage.</w:t>
+        <w:t>The instance: at t one, X is functioning properly. S sends a remote firmware change. B discovers that performance is degraded or standard replacement parts are rejected. S has directly impaired B's property.</w:t>
+        <w:br/>
+        <w:t>The rule: S executed the code modification directly, acting as the direct actor (mubâshir). Under Mecelle Article 92, the direct actor is liable for damages even without subjective malice. B is entitled to specific performance—the restoration of X to its warranted state—and full compensation for the incurred devaluation.</w:t>
       </w:r>
     </w:p>
     <w:p>
@@ -166,9 +239,9 @@
           <w:color w:val="1E3C6E"/>
           <w:sz w:val="24"/>
         </w:rPr>
-        <w:t>MODEL THREE: THE REPAIR IS CLOSED.</w:t>
+        <w:t>MODEL THREE: THE CLOSING OF REPAIR.</w:t>
         <w:br/>
-        <w:t>The model: X has an ordinary fault. B, or an independent expert, can fix it. B asks for nothing that belongs to S's copyright, patent or trade secret. He asks only for the diagnostic error information and standard repair access, and the replacement part meets every technical standard, so T is zero. S withholds the error information, or locks X with cryptographic pairing that rejects anything that did not come from S's own exclusive supply.</w:t>
+        <w:t>The model: X suffers an ordinary mechanical or electronic fault. B, or an independent qualified technician, can repair it. The repair involves standard physical parts and does not touch any proprietary root of trust, biometric encryption keys, or cryptographic authentication essential to user data protection, so T equals zero. S withholds the diagnostic trouble codes, or locks X with software serialization that rejects any component not sold through S's proprietary channel.</w:t>
       </w:r>
     </w:p>
     <w:p>
@@ -181,15 +254,21 @@
           <w:color w:val="1E3C6E"/>
           <w:sz w:val="24"/>
         </w:rPr>
-        <w:t>OUR FIFTH EVIDENCE: THE REPAIR IS CLOSED AND THE OWNER HAS ONE DOOR.</w:t>
+        <w:t>OUR FIFTH EVIDENCE: VOID RESTRAINTS ON OWNERSHIP AND MANUFACTURED DISTRESS.</w:t>
         <w:br/>
-        <w:t>The claim: when S reserves the means of repair exclusively to himself, he imposes an invalid condition that contradicts the essence of ownership, creates an artificial scarcity, and exploits the owner's necessitous condition. The proof has three steps. First, sale transfers full proprietorship to B, which inherently includes the right to repair and maintain the property. A condition imposed by S—whether express or embedded in hardware—that dictates "you may not repair this good, you may not take it to a qualified third party, you may not install compatible parts," directly contradicts the contractual essence of ownership (muqtadâ al-aqd). The jurists term such a condition a corrupting condition (shart fâsid); it is legally void, because S pockets the full price of ownership while withholding the essential prerogatives of ownership. Second, when diagnostic data and repair keys are withheld from the owner and confined solely to S's authorized network, the scarcity of repair is artificially manufactured by S. While classical ihtikâr refers to hoarding food staples from the market, leading jurists, including Abu Yusuf, extend the prohibition of ihtikâr to any artificial withholding of goods or essential services that causes public hardship (haraj). The refusal to supply repair access coupled with a restrictive lock produces this exact unlawful harm. Third, when the only party permitted to repair is the original seller, the owner is placed in a captive state of distress, forced to accept whatever exorbitant price S dictates. A report from Ali, may God be pleased with him, records that the Prophet forbade the exploitative transaction forced upon a person in distress (bay' al-mudtarr), reported by Abu Dawud.</w:t>
+        <w:t>The claim: when S conditions the sale of X upon an absolute prohibition of external repair, S imposes a void condition that contradicts the essence of ownership, manufactures artificial scarcity, and exploits the owner's necessitous state.</w:t>
         <w:br/>
-        <w:t>In this model, B asks for no proprietary blueprints, source code or trade secrets. S retains his intellectual property intact. B demands only fair, standard diagnostic access and unencumbered pairing, which are the natural incidents of physical ownership.</w:t>
+        <w:t xml:space="preserve">The proof has three steps. </w:t>
         <w:br/>
-        <w:t>The instance: the physical fault costs one unit of effort and materials to remedy. S's monopolized gate costs B ten units, and S has locked all other doors.</w:t>
+        <w:t xml:space="preserve">First, an absolute sale inherently transfers the unrestricted right of maintenance to the buyer. A condition imposed by S—whether by contractual clause or software lock—prohibiting the owner from opening, repairing, or servicing his property directly contradicts the contractual essence of sale (muqtadâ al-aqd). Under Islamic contract law, a condition that negates the essential rights of ownership while benefiting only the seller is a corrupting condition (shart fâsid), rendering the restraint null and void. </w:t>
         <w:br/>
-        <w:t>The rule: the seller cannot undo the completed effect of sale by locking the property against its owner; his attempt is legally void under Mecelle Article 100. The restrictive condition is null, and B has the unimpeded legal right to repair his own property through any competent provider.</w:t>
+        <w:t xml:space="preserve">Second, when S restricts diagnostic tools and parts to an exclusive network, S manufactures an artificial scarcity of essential maintenance. While classical ihtikâr focused on grain, leading jurists, including Abu Yusuf, extend the prohibition of ihtikâr to any deliberate withholding of necessary goods or repair services that inflicts general hardship (haraj) on the public. </w:t>
+        <w:br/>
+        <w:t>Third, by locking all independent doors, S forces the owner into a state of captive distress, compelling B to pay whatever inflated price S dictates or discard the asset. Abu Dawud reports from Ali, may God be pleased with him, that the Prophet forbade the exploitative transaction forced upon a person in distress (bay' al-mudtarr).</w:t>
+        <w:br/>
+        <w:t>The instance: an unbonded physical sensor fails. S's serialization lock rejects an identical, certified replacement, forcing B to pay tenfold at S's exclusive facility or discard X.</w:t>
+        <w:br/>
+        <w:t>The rule: under Mecelle Article 100, S's attempt to restrict the completed conveyance of ownership is legally void. The restrictive lock is an unlawful impediment, and B has the untrammeled right to repair his property through any competent provider.</w:t>
       </w:r>
     </w:p>
     <w:p>
@@ -204,7 +283,7 @@
         </w:rPr>
         <w:t>MODEL FOUR: THE SECTOR DYNAMICS.</w:t>
         <w:br/>
-        <w:t>The model: Models One, Two and Three evolve from isolated practices into an industry-wide dynamic. In this sector, producers who adopt planned obsolescence compete against those who build durable goods. The natural replacement of X due to shifting consumer preference, or genuine technological breakthroughs that render older goods obsolete by superior performance, are strictly excluded from this model. Only replacement forced by artificial failure, degradation, or closed repair belongs to it.</w:t>
+        <w:t>The model: Models One, Two and Three expand from isolated practices into an industry-wide dynamic. In this market, producers who implement concealed limits compete against producers who engineer durable goods. Natural replacement driven by consumer preference or authentic technological breakthroughs is excluded. The model encompasses only replacement compelled by premature breakdown, remote degradation, or repair monopolies.</w:t>
       </w:r>
     </w:p>
     <w:p>
@@ -217,15 +296,17 @@
           <w:color w:val="1E3C6E"/>
           <w:sz w:val="24"/>
         </w:rPr>
-        <w:t>OUR SIXTH EVIDENCE: WASTE AND THE BURDEN PUT ON THE COMMONS.</w:t>
+        <w:t>OUR SIXTH EVIDENCE: SYSTEMIC WASTE AND EXTERNALIZED DAMAGE TO THE COMMONS.</w:t>
         <w:br/>
-        <w:t>The claim: the private gain of premature replacement sales is pocketed by S, while the externalized ecological and resource costs are cast onto the public commons. The proof is mathematical. To deliver a given quantity of operational service over time, a good truncated to life L must be manufactured, transported, and discarded E over L times as often as a good built for life E. Let E be six units of time and L be three. The physical volume of goods manufactured and discarded exactly doubles. Each extra unit consumes virgin materials, energy, and disposal capacity. These externalized damages do not appear on S's invoice, yet they fall squarely upon society and the environment. The United Nations Global E-waste Monitor documented sixty-two million tonnes of electronic waste in 2022, finding that less than a quarter was properly collected and recycled, citing shorter product life cycles, restricted repairability, and design barriers as primary drivers. The arithmetic applies strictly to goods replaced because they were artificially disabled or broken.</w:t>
+        <w:t>The claim: the private profit of premature replacement sales is captured by S, while the externalized ecological degradation and material burdens are cast upon society and the environment.</w:t>
         <w:br/>
-        <w:t>Regarding causal liability: B is merely the final hand discarding the expired unit. S is the designer who engineered the premature end or disabled the good. When S disables X remotely, he is the direct actor (mubâshir). When X fails by design, S is the causal actor (mutasabbib) who acted with deliberate intent. In both instances, legal liability rests on S.</w:t>
+        <w:t xml:space="preserve">The proof: in a linear or partially circular production model, truncating the operational lifespan of a good from E to L forces society to manufacture, transport, and dispose of goods at a vastly accelerated rate. Even accounting for modern industrial recycling, material recovery is inherently imperfect: substantial thermodynamic, chemical, and energetic losses occur, while toxic e-waste accumulates. The United Nations Global E-waste Monitor documented sixty-two million tonnes of electronic waste in 2022, less than a quarter of which was formally recycled, identifying shortened life cycles and restricted repairability as primary drivers. </w:t>
         <w:br/>
-        <w:t>The governing principles of the Mecelle are unambiguous: a private harm is endured to avert a public harm (Article 26); the greater harm is removed by the lesser (Article 27); and the burden accompanies the benefit (Article 87). The depletion of finite resources and the accumulation of toxic waste constitute an undeniable public harm (darar amm). S's commercial desire for repetitive sales is merely a private benefit (darar khass). To avert the public harm, the door to artificial obsolescence must be closed.</w:t>
+        <w:t xml:space="preserve">Regarding causal liability: B is merely the last hand carrying the dead unit to the bin. S is the designer who engineered the premature end. When S degrades X remotely, S is the direct actor (mubâshir). When S designs X to fail at L, S is the causal actor (mutasabbib) who acted with intent. </w:t>
         <w:br/>
-        <w:t>The instance: N households each require utility X for twelve units of time. With E equal to six, each requires two units. With L equal to three, each must consume four units. The sector unnecessarily consumes and discards 2N additional units of goods, doubling the societal burden.</w:t>
+        <w:t>The maxims of the Mecelle govern this harm: a particular private harm is borne to repel a general public harm (Article 26); the greater harm is removed by the lesser (Article 27); and the burden follows the benefit (Article 87). The squandering of planetary resources and the poisoning of the commons constitute an undeniable public harm (darar âmm). S's commercial desire for recurring sales is merely a private interest. To prevent the public harm, the door of artificial obsolescence must be closed.</w:t>
+        <w:br/>
+        <w:t>The instance: a population of N users requires durable utility over a timeline of twelve units. When E equals ten, replacement demand is minimal; when L is curtailed to four, the volume of extracted, processed, and discarded units multiplies, needlessly burdening the ecological commons.</w:t>
       </w:r>
     </w:p>
     <w:p>
@@ -238,15 +319,17 @@
           <w:color w:val="1E3C6E"/>
           <w:sz w:val="24"/>
         </w:rPr>
-        <w:t>OUR SEVENTH EVIDENCE: THE WISDOM OF THE BAN IS ENMITY, AND THE PRACTICE BREEDS IT.</w:t>
+        <w:t>OUR SEVENTH EVIDENCE: LEGISLATIVE WISDOM: ENMITY AND THE CORROSION OF TRUST.</w:t>
         <w:br/>
-        <w:t>The claim: the practice systematically generates the societal enmity and distrust that the divine prohibition of deceit exists to prevent. In legal theory, enmity is not the operative ground (illa) of the ruling, because an illa must be an objective, measurable attribute, whereas an emotion is internal. The operative ground is deceit (taghrir and khiyana), established in the second evidence. Enmity is the underlying legislative wisdom (hikma) behind the prohibition. The Qur'an states in Surah Al-Ma'idah, verse 91, regarding the prohibition of intoxicants and gambling: "Satan only seeks to sow enmity and hatred among you." The identical rationale underpins the prohibition of commercial cheating: preserving trust and peace within the community.</w:t>
+        <w:t>The claim: the systemic practice of planned obsolescence breeds widespread social hostility and enmity, defeating the overarching legislative purpose of commercial ethics.</w:t>
         <w:br/>
-        <w:t>The proof: when a durable good ends by natural wear, B harbors no grievance; he recognizes natural material limits and accepts the outcome. But when B discovers that the termination was premeditated by design or firmware, his perception of S transforms from a trading partner into an adversary. This generates measurable societal friction: widespread disputes, grievances, and collective litigation.</w:t>
+        <w:t>In juristic methodology, enmity is not the operative legal ground (illa) of the prohibition, because an illa must be an objective, measurable attribute. The operative ground is deceit (taghrîr), established in our second evidence. Enmity is the underlying legislative wisdom (hikma) of the prohibition. The Qur'an states in Surah Al-Ma'idah, verse 91: "Satan only seeks to sow enmity and hatred among you." The identical wisdom underpins the prohibition of commercial cheating.</w:t>
         <w:br/>
-        <w:t>The instance: within the sector, buyer B1 discovers the hidden limit L. He alerts B2, and the knowledge spreads to B3. Collective distrust erupts, market cohesion dissolves, and peaceful commerce is replaced by adversarial hostility.</w:t>
+        <w:t>The proof: when a good perishes of natural wear, B harbors no grievance; he recognizes physical reality. But when B discovers that the failure was programmed by design or triggered by firmware, his view of S transforms from a trading partner into an adversary. This generates measurable societal friction: collective litigation, consumer outrage, and institutional distrust.</w:t>
         <w:br/>
-        <w:t>The rule: the prohibition stands firmly upon its legal ground of deceit, and the visible manifestation of enmity validates the divine wisdom of the law.</w:t>
+        <w:t>The instance: B1 discovers the hidden limit L, publishes the evidence, and the disclosure spreads. Mutual commercial goodwill is destroyed, replaced by adversarial cynicism.</w:t>
+        <w:br/>
+        <w:t>The rule: the prohibition stands firmly upon its operative ground of deceit, and the eruption of public enmity confirms the legislative wisdom of the law.</w:t>
       </w:r>
     </w:p>
     <w:p>
@@ -259,13 +342,15 @@
           <w:color w:val="1E3C6E"/>
           <w:sz w:val="24"/>
         </w:rPr>
-        <w:t>OUR EIGHTH EVIDENCE: ADVERSE SELECTION AND THE COLLAPSE OF MARKET INTEGRITY.</w:t>
+        <w:t>OUR EIGHTH EVIDENCE: ADVERSE SELECTION AND THE DESTRUCTION OF HONEST TRADE.</w:t>
         <w:br/>
-        <w:t>The claim: when artificial obsolescence spreads without transparent disclosure, dishonest practices systematically drive honest, durable goods out of the marketplace. The proof has five steps. Consumers cannot inspect the latent design lifespan of a complex durable good at the time of purchase. Market prices are formed predominantly on observable exterior attributes. Consequently, an honest producer who builds a good for life E at higher engineering cost cannot command a fair premium, because the buyer cannot verify the hidden longevity. Conversely, a producer who engineers an early limit L incurs lower manufacturing costs or accelerates repurchase revenue. He can undercut the honest producer's price or achieve excessive margins. The honest producer, facing uncompensated durability costs, is forced either to lower his standards to L or exit the market altogether. A commercial warranty does not resolve this information asymmetry; a warranty merely covers interim repair for a stipulated short duration and reveals nothing about total product longevity. The seller who plans the end easily sets L just beyond the warranty threshold. This dynamic represents classic adverse selection—the "market for lemons"—originating directly from the manufacturer's concealment of lifespan L.</w:t>
+        <w:t>The claim: when artificial limits are concealed, dishonest goods systematically drive durable, honest goods out of the market.</w:t>
         <w:br/>
-        <w:t>The instance: two producers, S one and S two, present competing goods on the market shelf at price P. S one builds for durability E, while S two secretly designs for premature failure L. S two captures higher returns or undercuts price, gradually compelling S one to abandon durability or go bankrupt, leaving consumers with an all-lemon market.</w:t>
+        <w:t>The proof: consumers cannot directly verify the internal lifespan of a complex durable good at the point of sale. Market prices are established based upon observable features. Consequently, an honest producer S1 who builds X for durability E at the same initial cost cannot communicate that hidden longevity to justify fair pricing. Meanwhile, producer S2 who limits X to L accelerates his repurchase cycle, collecting multiple sale prices over the same period. S2 captures outsized returns and deploys aggressive marketing. The honest producer S1, receiving no market premium for durability, is forced either to adopt artificial limits L or be driven out of business. A conventional commercial warranty does not resolve this information failure: a warranty merely guarantees repair during an introductory period and discloses nothing about post-warranty longevity; S2 simply programs L to trigger shortly after the warranty expires. This dynamic represents classic adverse selection—the market for lemons—originating directly from the concealment of lifespan L.</w:t>
         <w:br/>
-        <w:t>The rule: harm must be eliminated, and private gain cannot be tolerated at the expense of market collapse (Articles 20 and 26). The public supervisory authority (hisbah / market regulatory body) has a strict legal obligation to intervene, mandate durability disclosure, and prohibit concealed truncation to preserve fair competition and commercial honesty.</w:t>
+        <w:t>The instance: two producers, S1 and S2, offer goods of identical outward utility at price P. S1 builds for durability E; S2 programs limit L. S2 accelerates repeat sales, squeezing S1 out of the market until only truncated goods remain.</w:t>
+        <w:br/>
+        <w:t>The rule: harm must be eliminated (Mecelle Article 19), and a private gain cannot be tolerated when it destroys market integrity (Mecelle Article 26). The public regulatory authority (hisbah / market supervision) has the affirmative duty to prohibit concealed limits and mandate repairability standards to protect honest commerce.</w:t>
       </w:r>
     </w:p>
     <w:p>
@@ -278,23 +363,9 @@
           <w:color w:val="1E3C6E"/>
           <w:sz w:val="24"/>
         </w:rPr>
-        <w:t>THE GROUNDS ACCOUNTED FOR.</w:t>
+        <w:t>THE JURISTIC ACCOUNTING OF GROUNDS AND SYSTEMIC HARMS.</w:t>
         <w:br/>
-        <w:t>The legal grounds (illal) established across the eight evidences total ten distinct causes, distributed rigorously:</w:t>
-        <w:br/>
-        <w:t>Six grounds derive from the sacred texts and classical contract law:</w:t>
-        <w:br/>
-        <w:t>1. Eating wealth unjustly (ekl-i emvâl bi'l-bâtıl), in Evidence 1.</w:t>
-        <w:br/>
-        <w:t>2. Gross disparity between price and value (gabn-i fâhiş), in Evidence 1.</w:t>
-        <w:br/>
-        <w:t>3. Concealment and deceit (taghrir and gharar), in Evidence 2.</w:t>
-        <w:br/>
-        <w:t>4. Causing intentional harm (dırâr), in Evidence 3.</w:t>
-        <w:br/>
-        <w:t>5. Unauthorized disposal in another's property (tasarruf fî milk al-ghayr), in Evidence 4.</w:t>
-        <w:br/>
-        <w:t>6. The corrupting condition and artificial withholding (shart fâsid and the harm of ihtikâr), in Evidence 5.</w:t>
+        <w:t>To preserve precise methodology, the grounds are categorized into operative legal grounds (illal) and objective rational harms (mafâsid):</w:t>
       </w:r>
     </w:p>
     <w:p>
@@ -305,15 +376,19 @@
         <w:rPr>
           <w:sz w:val="21"/>
         </w:rPr>
-        <w:t>Four grounds derive from reason, systemic facts, and legal principles:</w:t>
+        <w:t>Six operative legal grounds (illal) derive from the texts and contract law:</w:t>
         <w:br/>
-        <w:t>7. Unlawful preemption and premature appropriation of benefit (isticel, Mecelle Article 99), in Evidence 3.</w:t>
+        <w:t>1. Eating wealth unjustly (ekl-i emvâl bi'l-bâtıl), in Evidence 1.</w:t>
         <w:br/>
-        <w:t>8. Severe misallocation of productive capital, in Evidence 3.</w:t>
+        <w:t>2. Gross disparity between price and value (gabn-i fâhiş), in Evidence 1.</w:t>
         <w:br/>
-        <w:t>9. Ecological waste and public harm to the commons (darar amm), in Evidence 6.</w:t>
+        <w:t>3. Concealment and deceit (taghrîr and gharar), in Evidence 2.</w:t>
         <w:br/>
-        <w:t>10. Systemic market degradation through adverse selection, in Evidence 8.</w:t>
+        <w:t>4. Causing intentional harm (dırâr), in Evidence 3.</w:t>
+        <w:br/>
+        <w:t>5. Unauthorized disposal in another's property (tasarruf fî milk al-ghayr), in Evidence 4.</w:t>
+        <w:br/>
+        <w:t>6. The corrupting condition, artificial withholding, and exploitation of distress (shart fâsid, ihtikâr, and bay' al-mudtarr), in Evidence 5.</w:t>
       </w:r>
     </w:p>
     <w:p>
@@ -324,9 +399,28 @@
         <w:rPr>
           <w:sz w:val="21"/>
         </w:rPr>
-        <w:t>Enmity (adâvet) is maintained as the underlying legislative wisdom (hikma) and is not counted among the operative grounds.</w:t>
+        <w:t>Four objective rational and systemic harms (mafâsid) derive from economic facts and legal maxims:</w:t>
         <w:br/>
-        <w:t>Examined from the objectives of Islamic jurisprudence (Maqasid al-Shariah), these grounds violate the protection of property (hifz al-mal), contractual integrity, social peace, and ecological balance. Planned obsolescence is not an ordinary commercial maneuver of a free market; it is a compounded contractual wrong.</w:t>
+        <w:t>7. Unlawful preemption and premature appropriation of benefit (isticel, Mecelle Article 99), in Evidence 3.</w:t>
+        <w:br/>
+        <w:t>8. Systemic misallocation of productive capital, in Evidence 3.</w:t>
+        <w:br/>
+        <w:t>9. Ecological waste and public harm to the commons (darar âmm, Mecelle Article 26), in Evidence 6.</w:t>
+        <w:br/>
+        <w:t>10. Systemic market collapse through adverse selection, in Evidence 8.</w:t>
+      </w:r>
+    </w:p>
+    <w:p>
+      <w:pPr>
+        <w:spacing w:after="120" w:line="276" w:lineRule="auto"/>
+      </w:pPr>
+      <w:r>
+        <w:rPr>
+          <w:sz w:val="21"/>
+        </w:rPr>
+        <w:t xml:space="preserve">Enmity (adâvet) remains the overarching legislative wisdom (hikma) and is not counted among the operative causes. </w:t>
+        <w:br/>
+        <w:t>Under the higher objectives of Islamic law (Maqâsid al-Sharî'ah), planned obsolescence violates the protection of property (hifz al-mâl), contractual trust, social peace, and environmental balance.</w:t>
       </w:r>
     </w:p>
     <w:p>
@@ -339,11 +433,7 @@
           <w:color w:val="1E3C6E"/>
           <w:sz w:val="24"/>
         </w:rPr>
-        <w:t>NOW THE EVIDENCES OF THE OTHER SIDE.</w:t>
-        <w:br/>
-        <w:t>The first defense of the producers: "The buyer accepted the terms of service and end-user license. He gave his consent."</w:t>
-        <w:br/>
-        <w:t>The refutation: consent in contract law must be enlightened, voluntary, and aligned with the essential purpose of the transaction. First, if explicit terms detailing the product's truncated lifespan L or unilateral degradation were clearly displayed prior to purchase, with full opportunity for B to reject without detriment, consent would be valid. That is not what occurs. Second, our refutation addresses the deceptive consent: adhesion terms presented only after P has been paid, ambiguous software agreements that mask subsequent utility reductions, and mandatory updates presented where refusal bricks the device. When B accepts a routine update presented as a "security patch," he consents to maintenance; he does not consent to the throttling of his processor or the intentional disabling of his battery. Under Islamic jurisprudence, consent obtained through misrepresentation or concealment is legally defective (rida ghayr sahîh). Conditions that negate the fundamental objective of the sale are null and void, and a forced electronic signature cannot substitute for genuine contractual consent.</w:t>
+        <w:t>NOW THE DEFENSES OF THE PRODUCERS.</w:t>
       </w:r>
     </w:p>
     <w:p>
@@ -354,9 +444,13 @@
         <w:rPr>
           <w:sz w:val="21"/>
         </w:rPr>
-        <w:t>The second defense: "We had no choice. For safety, stability, or legal compliance, we had to limit or retire the good."</w:t>
+        <w:t>The first defense: "The buyer accepted the end-user license agreement and service terms. Consent was given."</w:t>
         <w:br/>
-        <w:t>The refutation: this is the precise case where T is not zero, which lies entirely outside the definition of planned obsolescence. Where a genuine, demonstrable technical or safety necessity emerges, the law recognizes the excuse. However, necessity does not extinguish liability. Mecelle Article 33 establishes the timeless maxim: "Necessity does not invalidate the right of another" (Al-idtirâru lâ yubtilu haqqa'l-ghayr). The classical precedent is the starving traveler who consumes another's bread to preserve life: he is legally permitted to eat it, yet he remains strictly obligated to pay for its value afterwards. Therefore, when S genuinely discovers an unexpected safety hazard in X, S possesses the right and duty to intervene immediately to protect life. But S cannot use safety as a pretext to confiscate utility in secret. S must disclose the hazard transparently, provide an effective remedy, and make the owner whole for any unearned loss of value. Genuine technical necessity requires disclosure and restitution; silent degradation without remedy is an offense, not an engineering necessity.</w:t>
+        <w:t xml:space="preserve">The refutation: in contract law, consent must be free, informed, and directed toward a lawful subject matter. </w:t>
+        <w:br/>
+        <w:t>First, if S openly declared on the box or at contract: "This good will terminate after four units of time, and its repair is closed," B's purchase would constitute valid consent to a truncated asset, and S would be vindicated—provided S does not subsequently trespass upon the good. But modern producers never make this disclosure; their business model relies on concealing L while charging the price of E.</w:t>
+        <w:br/>
+        <w:t>Second, regarding clauses where B supposedly agrees that S may unilaterally degrade performance or brick functions remotely: such terms are legally void ab initio. In Islamic jurisprudence and modern unconscionability doctrine, a contractual term that negates the core objective of the contract (muqtadâ al-aqd) is a corrupting term (shart fâsid). A buyer cannot validly consent to the future sabotage of the very property he is purchasing. An adhesion clause buried in an electronic terms-of-service screen cannot legalize an unlawful trespass.</w:t>
       </w:r>
     </w:p>
     <w:p>
@@ -367,15 +461,30 @@
         <w:rPr>
           <w:sz w:val="21"/>
         </w:rPr>
-        <w:t>The third defense: "We sold the physical hardware, but we retained the software. We licensed the code, and we are free to modify or terminate it."</w:t>
+        <w:t>The second defense: "We had no choice. For safety, stability, or legal compliance, we had to intervene and limit the good."</w:t>
+        <w:br/>
+        <w:t xml:space="preserve">The refutation: this is the precise scenario where T is not zero, which lies entirely outside the definition of planned obsolescence. Where an authentic, verifiable safety hazard emerges, the law recognizes the excuse of necessity. </w:t>
+        <w:br/>
+        <w:t>However, necessity does not extinguish liability. Mecelle Article 33 establishes the timeless maxim: "Al-idtirâru lâ yubtilu haqqa'l-ghayr" (Necessity does not invalidate the right of another). The starving traveler who consumes another's bread to save his life commits no sin, but he remains strictly obligated to compensate the owner for the value of the bread. Therefore, when S discovers a genuine safety hazard in X, S is permitted and required to intervene to protect life. But S cannot use safety as a license to inflict uncompensated losses in secret. S must disclose the hazard transparently, provide an effective remedy, and restore or compensate the owner for any loss of utility. Transparent intervention accompanied by restitution is legitimate engineering; silent degradation that forces the owner to buy a new device is commercial fraud masquerading as safety.</w:t>
+      </w:r>
+    </w:p>
+    <w:p>
+      <w:pPr>
+        <w:spacing w:after="120" w:line="276" w:lineRule="auto"/>
+      </w:pPr>
+      <w:r>
+        <w:rPr>
+          <w:sz w:val="21"/>
+        </w:rPr>
+        <w:t>The third defense: "We sold the physical hardware, but we retained the software. We licensed the code, and we are free to modify or revoke it."</w:t>
         <w:br/>
         <w:t>The refutation: software must be analyzed according to its juristic reality across three distinct categories:</w:t>
         <w:br/>
-        <w:t>First, independent application software acquired separately and installed by the user on his own discretion: this can be legitimately licensed under copyright terms.</w:t>
+        <w:t>First, independent application software acquired separately: this can be legitimately licensed under copyright terms.</w:t>
         <w:br/>
-        <w:t>Second, embedded firmware and operating systems essential to the hardware's operation: without this code, X is reduced to an inert piece of metal. In jurisprudence, the accessory follows the principal: Mecelle Article 47 dictates that "what is subordinate to a thing in existence is subordinate to it in its legal ruling" (Al-tâbi'u tâbiun), and Article 48 states that "the subordinate cannot be given an independent ruling contrary to the principal." The hardware is the principal subject of sale; the integrated software is its indispensable attribute. The sale of X inherently conveys the right to the continuous, unhindered use of that embedded code. S retains copyright and patent rights, but S cannot revoke the operational soul of the purchased property.</w:t>
+        <w:t>Second, embedded firmware and operating systems essential to the hardware's operation: without this code, X is reduced to an inert piece of metal. In jurisprudence, the accessory follows the principal: Mecelle Article 47 dictates that "what is subordinate to a thing in existence is subordinate to it in its legal ruling" (Al-tâbi'u tâbiun), and Article 48 states that "the subordinate cannot be given an independent ruling contrary to the principal." The hardware is the principal subject of sale; the integrated firmware is its indispensable attribute. The sale of X inherently conveys the permanent right to the functional utility of that embedded code. S retains copyright and patent rights, but S cannot revoke the operational capacity of the sold property.</w:t>
         <w:br/>
-        <w:t>Third, remote cloud services hosted on S's infrastructure: here S legitimately asserts that the server infrastructure is his own. If an ongoing cloud service was promised at the time of sale, S is contractually bound to maintain it for the duration represented. When that term ends, S may terminate the cloud service with reasonable advance notice; however, S must leave the local physical good functional, or provide open local interfaces enabling the owner to operate X autonomously. In contracts, legal regard is paid to true meaning and intent, not superficial phrasing (Mecelle Article 3). If S intends merely to rent utility, he must explicitly frame the contract as a lease (ijârah) and price it as rent, assuming the lessor's ongoing maintenance burdens.</w:t>
+        <w:t>Third, remote cloud services hosted on S's infrastructure: here S legitimately asserts that the server infrastructure is his own. If an ongoing cloud service was promised at the time of sale, S is contractually bound to maintain it for the duration represented. When that term ends, S may terminate the cloud service with reasonable advance notice; however, S must leave the local physical good functional, or provide open local interfaces enabling the owner to operate X autonomously. In contracts, legal regard is paid to true meaning and intent, not superficial phrasing (Mecelle Article 3). If S wishes to maintain remote guardianship and unilateral revocation rights, S must honestly structure the transaction as a lease (ijârah) and price it as rent, assuming the ongoing maintenance burdens of a lessor.</w:t>
       </w:r>
     </w:p>
     <w:p>
@@ -414,16 +523,25 @@
         <w:t>Third: to force durable goods prematurely onto waste heaps generates severe public harm and squanders the earth's finite resources.</w:t>
         <w:br/>
         <w:t>Fourth: to cloak these practices under the labels of license, safety, terms of service, or innovation does not diminish the wrong; it merely layers deceit upon harm.</w:t>
-        <w:br/>
+      </w:r>
+    </w:p>
+    <w:p>
+      <w:pPr>
+        <w:spacing w:after="120" w:line="276" w:lineRule="auto"/>
+      </w:pPr>
+      <w:r>
+        <w:rPr>
+          <w:sz w:val="21"/>
+        </w:rPr>
         <w:t>For manufacturers, the boundary is clear and just:</w:t>
         <w:br/>
-        <w:t>If you produce economy goods, state their expected life honestly and sell them openly.</w:t>
+        <w:t>If you produce economy goods, declare their rated operational lifespan (MTBF or cycle count) honestly and sell them openly.</w:t>
         <w:br/>
         <w:t>If your hardware reaches its technical limit, declare the end of updates transparently and freeze the software in a stable, working state.</w:t>
         <w:br/>
         <w:t>If an authentic safety hazard arises, intervene openly, provide the remedy, and make the owner whole.</w:t>
         <w:br/>
-        <w:t>Relinquish control over goods you have sold, honor the owner's right to repair, and compete through authentic technological excellence. Any practice that transgresses these boundaries is not trade; it is exploitation.</w:t>
+        <w:t>Either sell the good completely and relinquish your proprietary control, or lease it honestly and shoulder the burdens of maintenance. Any practice that extracts the purchase price of sale while exercising the remote power of guardianship is not trade; it is an unlawful imposition. Thank you.</w:t>
       </w:r>
     </w:p>
     <w:sectPr>

</xml_diff>

<commit_message>
Antigravity: Metne yeni eklediğin **"THE ROOT CHARACTERIZATION: SALE VE…
</commit_message>
<xml_diff>
--- a/docs/planli_eskitme_hukuki_model.docx
+++ b/docs/planli_eskitme_hukuki_model.docx
@@ -25,7 +25,7 @@
           <w:color w:val="646464"/>
           <w:sz w:val="22"/>
         </w:rPr>
-        <w:t>A Formal Juristic &amp; Economic Model: Resolving the Sale vs. Guardianship Dichotomy</w:t>
+        <w:t>A Formal Juristic &amp; Economic Model Based on Commutative Integrity</w:t>
       </w:r>
     </w:p>
     <w:p/>
@@ -63,13 +63,17 @@
           <w:color w:val="1E3C6E"/>
           <w:sz w:val="24"/>
         </w:rPr>
-        <w:t>THE ROOT CHARACTERIZATION: SALE VERSUS DIGITAL GUARDIANSHIP.</w:t>
+        <w:t>THE ROOT CHARACTERIZATION: COMMUTATIVE INTEGRITY AND PROPRIETARY INTERFERENCE.</w:t>
         <w:br/>
-        <w:t xml:space="preserve">Before examining the models, the root conflict must be defined. Modern industry creates a profound contradiction in the law of obligations: S sells X under the outward form and full consideration of an absolute sale (bay'), pocketing a purchase price P that reflects complete transfer of ownership. Yet S simultaneously retains unilateral remote control, cryptographic locks, and telemetry channels, treating X as an ongoing servile custody or revocable license. </w:t>
+        <w:t>Before examining the models, the root conflict must be defined. The legal reality of planned obsolescence spans two distinct phases of contractual wrongdoing:</w:t>
         <w:br/>
-        <w:t xml:space="preserve">Islamic jurisprudence and universal contract law reject this hybrid distortion: contracts are judged by their legal reality and substance, not by formalistic labels (Mecelle Article 3: "Al-ibratu fi'l-uqûd li'l-maqâsid wa'l-ma'ânî, lâ li'l-alfâz wa'l-mabânî"). </w:t>
+        <w:t>First, at the inception of the contract (the factory phase, Model One), S collects the full capital price P of a durable good while secretly embedding an unearned, artificial durability defect L. In commutative contracts (mu'âwadât), value is exchanged for substance. To charge the customary price of durability while engineering premature material failure is a fraud upon the essence of exchange.</w:t>
         <w:br/>
-        <w:t>If S sells X, ownership (milk) passes unconditionally to B; S's authority over X ceases entirely. S cannot collect the price of ownership while retaining the keys of lordship. If S wishes to retain remote disposal, ongoing operational control, and unilateral modification rights, S must honestly designate the transaction as a lease (ijârah) or a continuous service contract, charging periodic rent and assuming the full lessor's obligation to maintain and repair the asset. But to collect the capital price of absolute sale while maintaining remote guardianship is an unlawful combination that corrupts the contract.</w:t>
+        <w:t xml:space="preserve">Second, after the conveyance of ownership (the post-sale phase, Models Two and Three), modern manufacturers increasingly commit a secondary wrong: having collected the full purchase price of an absolute sale (bay'), they retain unilateral operational strings, remote firmware throttles, and diagnostic repair monopolies, treating the sold asset as a perpetual servitude. </w:t>
+        <w:br/>
+        <w:t xml:space="preserve">Islamic jurisprudence and universal contract law reject this distortion: contracts are governed by their true substance and purpose, not by self-serving labels (Mecelle Article 3: "Al-ibratu fi'l-uqûd li'l-maqâsid wa'l-ma'ânî, lâ li'l-alfâz wa'l-mabânî"). </w:t>
+        <w:br/>
+        <w:t>In a valid sale, ownership (milk) transfers to B, and S's proprietary authority ceases. S cannot pocket the capital price of absolute ownership while holding the power to degrade the asset at will. If S wishes to retain continuous operational stewardship, unilateral software disposal, and maintenance custody, S must structure the transaction honestly as a lease (ijârah) or an ongoing service agreement, assuming the full legal risks, upkeep costs, and liability of an owner-lessor. But in an absolute sale, S must surrender control. S has no right to alter the asset after sale. Even if a post-sale safety hazard arises, product liability law permits intervention only under the strict doctrine of necessity (idtirâr) and tort liability—accompanied by transparency, voluntary recall, and full restitution to the owner.</w:t>
       </w:r>
     </w:p>
     <w:p>
@@ -95,9 +99,9 @@
         <w:br/>
         <w:t>First, natural material wear, which is unintended.</w:t>
         <w:br/>
-        <w:t>Second, declared design limits: where S openly discloses the minimum rated operational cycle (MTBF or rated cycle) on the packaging or contract, because custom and explicit stipulation govern the terms (Mecelle Article 43: "Al-ma'rûfu urfan ka'l-mashrûti shartan").</w:t>
+        <w:t>Second, declared design limits: where S openly discloses the rated operational lifespan (MTBF or rated cycle count) on the packaging or contract, because custom and explicit stipulation govern the terms (Mecelle Article 43: "Al-ma'rûfu urfan ka'l-mashrûti shartan").</w:t>
         <w:br/>
-        <w:t>Third, authentic hardware exhaustion: where older hardware lacks the physical computational capacity to run newly developed programs, S may decline to offer new feature upgrades, freezing the legacy software in its working state.</w:t>
+        <w:t>Third, authentic hardware exhaustion: where older hardware lacks the physical computational capacity to run newly developed programs, S may decline to offer new feature upgrades, leaving the legacy software intact in its working state.</w:t>
         <w:br/>
         <w:t>Fourth, third-party service discontinuation, provided S did not conceal an intrinsic dependency.</w:t>
         <w:br/>
@@ -142,13 +146,13 @@
         </w:rPr>
         <w:t>OUR FIRST EVIDENCE: FRAUDULENT DISPARITY AND CONCEALMENT OF VALUE.</w:t>
         <w:br/>
-        <w:t>The claim: in commutative contracts (mu'âwadât), mutual consent requires transparency regarding the essential attributes that define value, and price extracted through deliberate concealment of a lifespan-halving defect constitutes unlawful appropriation of property.</w:t>
+        <w:t>The claim: in commutative contracts (mu'âwadât), mutual consent requires transparency regarding the essential attributes that define value, and price extracted through deliberate concealment of an artificial durability defect constitutes unlawful appropriation of property.</w:t>
         <w:br/>
-        <w:t>The proof: durable goods are acquired for their continuous stream of utility over time. When S intentionally plants limit L before sale, S knows the good is inherently defective in durability, while B cannot detect this latent defect at t zero. B pays price P expecting ten units of operational life, but receives an asset engineered to terminate at four. While contract law tolerates minor subjective discrepancies (gabn-i yesîr) in commercial goods, a deliberate truncation from ten units of life to four units constitutes an egregious, unconscionable disparity (gabn-i fâhiş) accompanied by active concealment (taghrîr).</w:t>
+        <w:t>The proof: durable goods are acquired for their stream of utility over time. When S intentionally plants limit L before sale, S knows the good is inherently defective in durability, while B cannot detect this latent defect at t zero. B pays price P expecting ten units of operational life, but receives an asset engineered to terminate at four. While contract law tolerates minor subjective discrepancies (gabn-i yesîr) in commercial goods, expert appraisers (ahl al-khibrah) evaluate the true financial value of an asset whose life is cut from ten units to four. Because an asset designed to fail prematurely loses a major proportion of its commercial valuation at the very moment of contract, the resulting gap between the price paid P and the true objective value constitutes an egregious, unconscionable disparity (gabn-i fâhiş) accompanied by active fraudulent concealment (taghrîr).</w:t>
         <w:br/>
-        <w:t>The Qur'an commands in Surah An-Nisa, verse 29: "Do not consume your wealth among yourselves by false ways." Extracting the full market price of a durable good while concealing that more than half of its natural lifespan has been engineered out is consuming property by falsehood (ekl-i emvâl bi'l-bâtıl).</w:t>
+        <w:t>The Qur'an commands in Surah An-Nisa, verse 29: "Do not consume your wealth among yourselves by false ways." Extracting the full market price of a durable good while concealing an engineered durability flaw that severely depresses its real value is consuming property by falsehood (ekl-i emvâl bi'l-bâtıl).</w:t>
         <w:br/>
-        <w:t>The rule: a sale tainted by fraudulent concealment (taghrîr) and gross disparity (gabn-i fâhiş) is non-binding (ghayr lâzim) on the deceived buyer. Under Mecelle Article 356, B possesses the legal option to rescind the sale and recover the purchase price P in full upon returning X. If returning the good is barred due to consumption, destruction, or irreversible alteration, the governing rules of latent defect (Mecelle Articles 343, 344 and 345) entitle B to financial compensation for the price diminution (noksan-ı semen / arsh). The seller S cannot retain the full price.</w:t>
+        <w:t>The rule: a sale tainted by fraudulent concealment (taghrîr) and gross disparity (gabn-i fâhiş) is non-binding (ghayr lâzim) on the deceived buyer. Under Mecelle Article 356, B possesses the legal option to rescind the sale and recover the purchase price P in full upon returning X. If returning the good is barred due to consumption, destruction, or irreversible alteration, the governing rules of latent defect (Mecelle Articles 343, 344 and 345) entitle B to financial compensation for the price diminution (noksan-ı semen / arsh). The seller S cannot retain the unearned price.</w:t>
       </w:r>
     </w:p>
     <w:p>
@@ -283,7 +287,7 @@
         </w:rPr>
         <w:t>MODEL FOUR: THE SECTOR DYNAMICS.</w:t>
         <w:br/>
-        <w:t>The model: Models One, Two and Three expand from isolated practices into an industry-wide dynamic. In this market, producers who implement concealed limits compete against producers who engineer durable goods. Natural replacement driven by consumer preference or authentic technological breakthroughs is excluded. The model encompasses only replacement compelled by premature breakdown, remote degradation, or repair monopolies.</w:t>
+        <w:t>The model: Models One, Two and Three expand from isolated practices into an industry-wide dynamic. In this market, producers who implement concealed limits compete against producers who engineer durable goods. The model analyzes two successive phases of consumer and market reaction: the informational gap where repeat purchases occur, followed by the revelation of deceit and systemic collapse.</w:t>
       </w:r>
     </w:p>
     <w:p>
@@ -304,7 +308,7 @@
         <w:br/>
         <w:t xml:space="preserve">Regarding causal liability: B is merely the last hand carrying the dead unit to the bin. S is the designer who engineered the premature end. When S degrades X remotely, S is the direct actor (mubâshir). When S designs X to fail at L, S is the causal actor (mutasabbib) who acted with intent. </w:t>
         <w:br/>
-        <w:t>The maxims of the Mecelle govern this harm: a particular private harm is borne to repel a general public harm (Article 26); the greater harm is removed by the lesser (Article 27); and the burden follows the benefit (Article 87). The squandering of planetary resources and the poisoning of the commons constitute an undeniable public harm (darar âmm). S's commercial desire for recurring sales is merely a private interest. To prevent the public harm, the door of artificial obsolescence must be closed.</w:t>
+        <w:t>The maxims of the Mecelle govern this harm: a particular private harm is borne to repel a general public harm (Article 26); the greater harm is removed by the lesser (Article 27); and the burden follows the benefit (Mecelle Article 85: "Al-gurmu bi'l-gunm"). The squandering of planetary resources and the poisoning of the commons constitute an undeniable public harm (darar âmm). S's commercial desire for recurring sales is merely a private interest. To prevent the public harm, the door of artificial obsolescence must be closed.</w:t>
         <w:br/>
         <w:t>The instance: a population of N users requires durable utility over a timeline of twelve units. When E equals ten, replacement demand is minimal; when L is curtailed to four, the volume of extracted, processed, and discarded units multiplies, needlessly burdening the ecological commons.</w:t>
       </w:r>
@@ -321,13 +325,13 @@
         </w:rPr>
         <w:t>OUR SEVENTH EVIDENCE: LEGISLATIVE WISDOM: ENMITY AND THE CORROSION OF TRUST.</w:t>
         <w:br/>
-        <w:t>The claim: the systemic practice of planned obsolescence breeds widespread social hostility and enmity, defeating the overarching legislative purpose of commercial ethics.</w:t>
+        <w:t>The claim: the systemic practice of planned obsolescence breeds widespread social hostility and enmity once discovered, defeating the overarching legislative purpose of commercial ethics.</w:t>
         <w:br/>
         <w:t>In juristic methodology, enmity is not the operative legal ground (illa) of the prohibition, because an illa must be an objective, measurable attribute. The operative ground is deceit (taghrîr), established in our second evidence. Enmity is the underlying legislative wisdom (hikma) of the prohibition. The Qur'an states in Surah Al-Ma'idah, verse 91: "Satan only seeks to sow enmity and hatred among you." The identical wisdom underpins the prohibition of commercial cheating.</w:t>
         <w:br/>
-        <w:t>The proof: when a good perishes of natural wear, B harbors no grievance; he recognizes physical reality. But when B discovers that the failure was programmed by design or triggered by firmware, his view of S transforms from a trading partner into an adversary. This generates measurable societal friction: collective litigation, consumer outrage, and institutional distrust.</w:t>
+        <w:t>The proof: when a good perishes of natural wear, B harbors no grievance; he recognizes physical reality. But when investigative disclosure or whistleblowing reveals that the failure was programmed by design or triggered by firmware, consumer perception transforms from ordinary trade into betrayal. The resulting friction erupts into collective litigation, consumer boycotts, and institutional cynicism.</w:t>
         <w:br/>
-        <w:t>The instance: B1 discovers the hidden limit L, publishes the evidence, and the disclosure spreads. Mutual commercial goodwill is destroyed, replaced by adversarial cynicism.</w:t>
+        <w:t>The instance: consumer advocacy groups expose the hidden limit L. The revelation destroys goodwill, replacing market trust with defensive hostility.</w:t>
         <w:br/>
         <w:t>The rule: the prohibition stands firmly upon its operative ground of deceit, and the eruption of public enmity confirms the legislative wisdom of the law.</w:t>
       </w:r>
@@ -344,13 +348,13 @@
         </w:rPr>
         <w:t>OUR EIGHTH EVIDENCE: ADVERSE SELECTION AND THE DESTRUCTION OF HONEST TRADE.</w:t>
         <w:br/>
-        <w:t>The claim: when artificial limits are concealed, dishonest goods systematically drive durable, honest goods out of the market.</w:t>
+        <w:t>The claim: during the period of information opacity—before consumers uncover the artificial limit—dishonest goods systematically drive durable, honest goods out of the marketplace.</w:t>
         <w:br/>
-        <w:t>The proof: consumers cannot directly verify the internal lifespan of a complex durable good at the point of sale. Market prices are established based upon observable features. Consequently, an honest producer S1 who builds X for durability E at the same initial cost cannot communicate that hidden longevity to justify fair pricing. Meanwhile, producer S2 who limits X to L accelerates his repurchase cycle, collecting multiple sale prices over the same period. S2 captures outsized returns and deploys aggressive marketing. The honest producer S1, receiving no market premium for durability, is forced either to adopt artificial limits L or be driven out of business. A conventional commercial warranty does not resolve this information failure: a warranty merely guarantees repair during an introductory period and discloses nothing about post-warranty longevity; S2 simply programs L to trigger shortly after the warranty expires. This dynamic represents classic adverse selection—the market for lemons—originating directly from the concealment of lifespan L.</w:t>
+        <w:t>The proof: consumers cannot directly verify the internal lifespan of a complex durable good at the point of sale. Prior to the widespread revelation described in Evidence Seven, market prices are formed based on observable external features. Because buyers cannot detect the hidden difference between E and L, an honest producer S1 who builds X for durability E cannot command a fair price premium. Meanwhile, producer S2 who limits X to L accelerates his repurchase cycle; uninformed buyers, attributing early failure to bad luck or natural fatigue, buy again. S2 captures outsized replacement revenues and aggressively expands marketing. The honest producer S1, receiving no premium for longevity and suffering longer sales intervals, is forced either to adopt artificial limits L or exit the market. A conventional warranty does not resolve this asymmetry: a warranty merely covers introductory failures, and S2 easily programs L to trigger shortly after the warranty expires. This dynamic represents classic adverse selection—the market for lemons—originating directly from the concealment of lifespan L.</w:t>
         <w:br/>
-        <w:t>The instance: two producers, S1 and S2, offer goods of identical outward utility at price P. S1 builds for durability E; S2 programs limit L. S2 accelerates repeat sales, squeezing S1 out of the market until only truncated goods remain.</w:t>
+        <w:t>The instance: two producers, S1 and S2, offer goods of identical outward appearance at price P. S1 builds for durability E; S2 programs limit L. Before the deceit is exposed, S2 extracts repetitive sales from unsuspecting buyers, gradually bankrupting S1 until only truncated goods survive on the market.</w:t>
         <w:br/>
-        <w:t>The rule: harm must be eliminated (Mecelle Article 19), and a private gain cannot be tolerated when it destroys market integrity (Mecelle Article 26). The public regulatory authority (hisbah / market supervision) has the affirmative duty to prohibit concealed limits and mandate repairability standards to protect honest commerce.</w:t>
+        <w:t>The rule: harm must be eliminated (Mecelle Article 19), and private gain cannot be tolerated when it destroys market integrity (Mecelle Article 26). The public regulatory authority (hisbah / market supervision) has the affirmative duty to prohibit concealed limits and mandate repairability standards to protect honest commerce.</w:t>
       </w:r>
     </w:p>
     <w:p>
@@ -448,7 +452,7 @@
         <w:br/>
         <w:t xml:space="preserve">The refutation: in contract law, consent must be free, informed, and directed toward a lawful subject matter. </w:t>
         <w:br/>
-        <w:t>First, if S openly declared on the box or at contract: "This good will terminate after four units of time, and its repair is closed," B's purchase would constitute valid consent to a truncated asset, and S would be vindicated—provided S does not subsequently trespass upon the good. But modern producers never make this disclosure; their business model relies on concealing L while charging the price of E.</w:t>
+        <w:t>First, if S openly declared on the box or at contract: "This good is designed for a rated life of four units of operational time, and its repair is closed," B's purchase would constitute valid consent to a truncated asset, and S would be vindicated—provided S does not subsequently trespass upon the good. But modern producers never make this disclosure; their business model relies on concealing L while charging the price of E.</w:t>
         <w:br/>
         <w:t>Second, regarding clauses where B supposedly agrees that S may unilaterally degrade performance or brick functions remotely: such terms are legally void ab initio. In Islamic jurisprudence and modern unconscionability doctrine, a contractual term that negates the core objective of the contract (muqtadâ al-aqd) is a corrupting term (shart fâsid). A buyer cannot validly consent to the future sabotage of the very property he is purchasing. An adhesion clause buried in an electronic terms-of-service screen cannot legalize an unlawful trespass.</w:t>
       </w:r>
@@ -465,7 +469,7 @@
         <w:br/>
         <w:t xml:space="preserve">The refutation: this is the precise scenario where T is not zero, which lies entirely outside the definition of planned obsolescence. Where an authentic, verifiable safety hazard emerges, the law recognizes the excuse of necessity. </w:t>
         <w:br/>
-        <w:t>However, necessity does not extinguish liability. Mecelle Article 33 establishes the timeless maxim: "Al-idtirâru lâ yubtilu haqqa'l-ghayr" (Necessity does not invalidate the right of another). The starving traveler who consumes another's bread to save his life commits no sin, but he remains strictly obligated to compensate the owner for the value of the bread. Therefore, when S discovers a genuine safety hazard in X, S is permitted and required to intervene to protect life. But S cannot use safety as a license to inflict uncompensated losses in secret. S must disclose the hazard transparently, provide an effective remedy, and restore or compensate the owner for any loss of utility. Transparent intervention accompanied by restitution is legitimate engineering; silent degradation that forces the owner to buy a new device is commercial fraud masquerading as safety.</w:t>
+        <w:t>However, necessity does not extinguish liability. Mecelle Article 33 establishes the timeless maxim: "Al-idtirâru lâ yubtilu haqqa'l-ghayr" (Necessity does not invalidate the right of another). The starving traveler who consumes another's bread to save his life commits no sin, but he remains strictly obligated to compensate the owner for the value of the bread. In product liability, this does not grant S a proprietary right to trespass at will; it governs tortious emergencies. When an unexpected hazard threatens life, S must issue an open safety recall, provide a prompt remedy, and make the owner whole. S cannot cite safety as a pretext to silently degrade utility and force a replacement sale. Genuine necessity requires transparent remediation and restitution; silent degradation without remedy is an offense.</w:t>
       </w:r>
     </w:p>
     <w:p>

</xml_diff>